<commit_message>
More detail on development.
</commit_message>
<xml_diff>
--- a/digitaltool_2024_03_13.docx
+++ b/digitaltool_2024_03_13.docx
@@ -1060,7 +1060,197 @@
               <w:rPr>
                 <w:lang w:val="en-GB"/>
               </w:rPr>
-              <w:t xml:space="preserve"> will develop an open source linkworking tool. Describe here more in detail how. This task will result in a demonstrator which is D6.2. The results of T6.3 feed into T6.4 and T6.5.</w:t>
+              <w:t xml:space="preserve"> will develop an open source linkworking tool. </w:t>
+            </w:r>
+            <w:r>
+              <w:rPr>
+                <w:lang w:val="en-GB"/>
+              </w:rPr>
+              <w:t>Active Group will</w:t>
+            </w:r>
+            <w:r>
+              <w:rPr>
+                <w:lang w:val="en-GB"/>
+              </w:rPr>
+              <w:t xml:space="preserve"> </w:t>
+            </w:r>
+            <w:r>
+              <w:rPr>
+                <w:lang w:val="en-GB"/>
+              </w:rPr>
+              <w:t>set up development infrastructure including source-code management, issue tracking, and a reproducible build environment and continuous-integration proces</w:t>
+            </w:r>
+          </w:p>
+          <w:p>
+            <w:pPr>
+              <w:pStyle w:val="ListParagraph"/>
+              <w:numPr>
+                <w:ilvl w:val="0"/>
+                <w:numId w:val="4"/>
+              </w:numPr>
+              <w:spacing w:before="60" w:after="60"/>
+              <w:rPr>
+                <w:lang w:val="en-GB"/>
+              </w:rPr>
+            </w:pPr>
+            <w:r>
+              <w:rPr>
+                <w:lang w:val="en-GB"/>
+              </w:rPr>
+              <w:t>assemble a sample dataset for presentation in the tool</w:t>
+            </w:r>
+            <w:r>
+              <w:rPr>
+                <w:lang w:val="en-GB"/>
+              </w:rPr>
+              <w:t>,</w:t>
+            </w:r>
+          </w:p>
+          <w:p>
+            <w:pPr>
+              <w:pStyle w:val="ListParagraph"/>
+              <w:numPr>
+                <w:ilvl w:val="0"/>
+                <w:numId w:val="4"/>
+              </w:numPr>
+              <w:spacing w:before="60" w:after="60"/>
+              <w:rPr>
+                <w:lang w:val="en-GB"/>
+              </w:rPr>
+            </w:pPr>
+            <w:r>
+              <w:rPr>
+                <w:lang w:val="en-GB"/>
+              </w:rPr>
+              <w:t>implement a backend for the tool, and provide it with the sample dataset</w:t>
+            </w:r>
+            <w:r>
+              <w:rPr>
+                <w:lang w:val="en-GB"/>
+              </w:rPr>
+              <w:t>,</w:t>
+            </w:r>
+          </w:p>
+          <w:p>
+            <w:pPr>
+              <w:pStyle w:val="ListParagraph"/>
+              <w:numPr>
+                <w:ilvl w:val="0"/>
+                <w:numId w:val="4"/>
+              </w:numPr>
+              <w:spacing w:before="60" w:after="60"/>
+              <w:rPr>
+                <w:lang w:val="en-GB"/>
+              </w:rPr>
+            </w:pPr>
+            <w:r>
+              <w:rPr>
+                <w:lang w:val="en-GB"/>
+              </w:rPr>
+              <w:t>implement</w:t>
+            </w:r>
+            <w:r>
+              <w:rPr>
+                <w:lang w:val="en-GB"/>
+              </w:rPr>
+              <w:t xml:space="preserve"> a frontend for linkworkers that allows finding local offerings.</w:t>
+            </w:r>
+          </w:p>
+          <w:p>
+            <w:pPr>
+              <w:spacing w:before="60" w:after="60"/>
+              <w:rPr>
+                <w:lang w:val="en-GB"/>
+              </w:rPr>
+            </w:pPr>
+            <w:r>
+              <w:rPr>
+                <w:lang w:val="en-GB"/>
+              </w:rPr>
+              <w:t>P</w:t>
+            </w:r>
+            <w:r>
+              <w:rPr>
+                <w:lang w:val="en-GB"/>
+              </w:rPr>
+              <w:t>arallel to the backend/frontend</w:t>
+            </w:r>
+            <w:r>
+              <w:rPr>
+                <w:lang w:val="en-GB"/>
+              </w:rPr>
+              <w:t xml:space="preserve"> development, Active Group will:</w:t>
+            </w:r>
+          </w:p>
+          <w:p>
+            <w:pPr>
+              <w:pStyle w:val="ListParagraph"/>
+              <w:numPr>
+                <w:ilvl w:val="0"/>
+                <w:numId w:val="4"/>
+              </w:numPr>
+              <w:spacing w:before="60" w:after="60"/>
+              <w:rPr>
+                <w:lang w:val="en-GB"/>
+              </w:rPr>
+            </w:pPr>
+            <w:r>
+              <w:rPr>
+                <w:lang w:val="en-GB"/>
+              </w:rPr>
+              <w:t>implement a scraper for local offerings from public GIS sources,</w:t>
+            </w:r>
+          </w:p>
+          <w:p>
+            <w:pPr>
+              <w:pStyle w:val="ListParagraph"/>
+              <w:numPr>
+                <w:ilvl w:val="0"/>
+                <w:numId w:val="4"/>
+              </w:numPr>
+              <w:spacing w:before="60" w:after="60"/>
+              <w:rPr>
+                <w:lang w:val="en-GB"/>
+              </w:rPr>
+            </w:pPr>
+            <w:r>
+              <w:rPr>
+                <w:lang w:val="en-GB"/>
+              </w:rPr>
+              <w:t>implement a curation frontend for the system,</w:t>
+            </w:r>
+          </w:p>
+          <w:p>
+            <w:pPr>
+              <w:pStyle w:val="ListParagraph"/>
+              <w:numPr>
+                <w:ilvl w:val="0"/>
+                <w:numId w:val="4"/>
+              </w:numPr>
+              <w:spacing w:before="60" w:after="60"/>
+              <w:rPr>
+                <w:lang w:val="en-GB"/>
+              </w:rPr>
+            </w:pPr>
+            <w:r>
+              <w:rPr>
+                <w:lang w:val="en-GB"/>
+              </w:rPr>
+              <w:t>implement an AI-based curator for these sources.</w:t>
+            </w:r>
+          </w:p>
+          <w:p>
+            <w:pPr>
+              <w:spacing w:before="60" w:after="60"/>
+              <w:rPr>
+                <w:lang w:val="en-GB"/>
+              </w:rPr>
+            </w:pPr>
+            <w:r>
+              <w:rPr>
+                <w:lang w:val="en-GB"/>
+              </w:rPr>
+              <w:t>This task will result in a demonstrator which is D6.2. The results of T6.3 feed into T6.4 and T6.5.</w:t>
             </w:r>
           </w:p>
           <w:p>
@@ -1351,6 +1541,7 @@
                 <w:b/>
                 <w:lang w:val="en-GB"/>
               </w:rPr>
+              <w:lastRenderedPageBreak/>
               <w:t xml:space="preserve">Work package number </w:t>
             </w:r>
           </w:p>
@@ -1534,7 +1725,6 @@
               <w:rPr>
                 <w:lang w:val="en-GB"/>
               </w:rPr>
-              <w:lastRenderedPageBreak/>
               <w:t>Train and support link workers to use the tool</w:t>
             </w:r>
           </w:p>
@@ -6240,6 +6430,230 @@
     </w:lvl>
   </w:abstractNum>
   <w:abstractNum w:abstractNumId="1" w15:restartNumberingAfterBreak="0">
+    <w:nsid w:val="09A10EA7"/>
+    <w:multiLevelType w:val="hybridMultilevel"/>
+    <w:tmpl w:val="A51479EE"/>
+    <w:lvl w:ilvl="0" w:tplc="69FE9A4A">
+      <w:numFmt w:val="bullet"/>
+      <w:lvlText w:val="-"/>
+      <w:lvlJc w:val="left"/>
+      <w:pPr>
+        <w:ind w:left="720" w:hanging="360"/>
+      </w:pPr>
+      <w:rPr>
+        <w:rFonts w:ascii="Times New Roman" w:eastAsiaTheme="minorHAnsi" w:hAnsi="Times New Roman" w:cs="Times New Roman" w:hint="default"/>
+      </w:rPr>
+    </w:lvl>
+    <w:lvl w:ilvl="1" w:tplc="08090003" w:tentative="1">
+      <w:start w:val="1"/>
+      <w:numFmt w:val="bullet"/>
+      <w:lvlText w:val="o"/>
+      <w:lvlJc w:val="left"/>
+      <w:pPr>
+        <w:ind w:left="1440" w:hanging="360"/>
+      </w:pPr>
+      <w:rPr>
+        <w:rFonts w:ascii="Courier New" w:hAnsi="Courier New" w:hint="default"/>
+      </w:rPr>
+    </w:lvl>
+    <w:lvl w:ilvl="2" w:tplc="08090005" w:tentative="1">
+      <w:start w:val="1"/>
+      <w:numFmt w:val="bullet"/>
+      <w:lvlText w:val=""/>
+      <w:lvlJc w:val="left"/>
+      <w:pPr>
+        <w:ind w:left="2160" w:hanging="360"/>
+      </w:pPr>
+      <w:rPr>
+        <w:rFonts w:ascii="Wingdings" w:hAnsi="Wingdings" w:hint="default"/>
+      </w:rPr>
+    </w:lvl>
+    <w:lvl w:ilvl="3" w:tplc="08090001" w:tentative="1">
+      <w:start w:val="1"/>
+      <w:numFmt w:val="bullet"/>
+      <w:lvlText w:val=""/>
+      <w:lvlJc w:val="left"/>
+      <w:pPr>
+        <w:ind w:left="2880" w:hanging="360"/>
+      </w:pPr>
+      <w:rPr>
+        <w:rFonts w:ascii="Symbol" w:hAnsi="Symbol" w:hint="default"/>
+      </w:rPr>
+    </w:lvl>
+    <w:lvl w:ilvl="4" w:tplc="08090003" w:tentative="1">
+      <w:start w:val="1"/>
+      <w:numFmt w:val="bullet"/>
+      <w:lvlText w:val="o"/>
+      <w:lvlJc w:val="left"/>
+      <w:pPr>
+        <w:ind w:left="3600" w:hanging="360"/>
+      </w:pPr>
+      <w:rPr>
+        <w:rFonts w:ascii="Courier New" w:hAnsi="Courier New" w:hint="default"/>
+      </w:rPr>
+    </w:lvl>
+    <w:lvl w:ilvl="5" w:tplc="08090005" w:tentative="1">
+      <w:start w:val="1"/>
+      <w:numFmt w:val="bullet"/>
+      <w:lvlText w:val=""/>
+      <w:lvlJc w:val="left"/>
+      <w:pPr>
+        <w:ind w:left="4320" w:hanging="360"/>
+      </w:pPr>
+      <w:rPr>
+        <w:rFonts w:ascii="Wingdings" w:hAnsi="Wingdings" w:hint="default"/>
+      </w:rPr>
+    </w:lvl>
+    <w:lvl w:ilvl="6" w:tplc="08090001" w:tentative="1">
+      <w:start w:val="1"/>
+      <w:numFmt w:val="bullet"/>
+      <w:lvlText w:val=""/>
+      <w:lvlJc w:val="left"/>
+      <w:pPr>
+        <w:ind w:left="5040" w:hanging="360"/>
+      </w:pPr>
+      <w:rPr>
+        <w:rFonts w:ascii="Symbol" w:hAnsi="Symbol" w:hint="default"/>
+      </w:rPr>
+    </w:lvl>
+    <w:lvl w:ilvl="7" w:tplc="08090003" w:tentative="1">
+      <w:start w:val="1"/>
+      <w:numFmt w:val="bullet"/>
+      <w:lvlText w:val="o"/>
+      <w:lvlJc w:val="left"/>
+      <w:pPr>
+        <w:ind w:left="5760" w:hanging="360"/>
+      </w:pPr>
+      <w:rPr>
+        <w:rFonts w:ascii="Courier New" w:hAnsi="Courier New" w:hint="default"/>
+      </w:rPr>
+    </w:lvl>
+    <w:lvl w:ilvl="8" w:tplc="08090005" w:tentative="1">
+      <w:start w:val="1"/>
+      <w:numFmt w:val="bullet"/>
+      <w:lvlText w:val=""/>
+      <w:lvlJc w:val="left"/>
+      <w:pPr>
+        <w:ind w:left="6480" w:hanging="360"/>
+      </w:pPr>
+      <w:rPr>
+        <w:rFonts w:ascii="Wingdings" w:hAnsi="Wingdings" w:hint="default"/>
+      </w:rPr>
+    </w:lvl>
+  </w:abstractNum>
+  <w:abstractNum w:abstractNumId="2" w15:restartNumberingAfterBreak="0">
+    <w:nsid w:val="3957737B"/>
+    <w:multiLevelType w:val="hybridMultilevel"/>
+    <w:tmpl w:val="E8D4BAE2"/>
+    <w:lvl w:ilvl="0" w:tplc="684CAE14">
+      <w:numFmt w:val="bullet"/>
+      <w:lvlText w:val="-"/>
+      <w:lvlJc w:val="left"/>
+      <w:pPr>
+        <w:ind w:left="720" w:hanging="360"/>
+      </w:pPr>
+      <w:rPr>
+        <w:rFonts w:ascii="Times New Roman" w:eastAsiaTheme="minorHAnsi" w:hAnsi="Times New Roman" w:cs="Times New Roman" w:hint="default"/>
+      </w:rPr>
+    </w:lvl>
+    <w:lvl w:ilvl="1" w:tplc="08090003" w:tentative="1">
+      <w:start w:val="1"/>
+      <w:numFmt w:val="bullet"/>
+      <w:lvlText w:val="o"/>
+      <w:lvlJc w:val="left"/>
+      <w:pPr>
+        <w:ind w:left="1440" w:hanging="360"/>
+      </w:pPr>
+      <w:rPr>
+        <w:rFonts w:ascii="Courier New" w:hAnsi="Courier New" w:hint="default"/>
+      </w:rPr>
+    </w:lvl>
+    <w:lvl w:ilvl="2" w:tplc="08090005" w:tentative="1">
+      <w:start w:val="1"/>
+      <w:numFmt w:val="bullet"/>
+      <w:lvlText w:val=""/>
+      <w:lvlJc w:val="left"/>
+      <w:pPr>
+        <w:ind w:left="2160" w:hanging="360"/>
+      </w:pPr>
+      <w:rPr>
+        <w:rFonts w:ascii="Wingdings" w:hAnsi="Wingdings" w:hint="default"/>
+      </w:rPr>
+    </w:lvl>
+    <w:lvl w:ilvl="3" w:tplc="08090001" w:tentative="1">
+      <w:start w:val="1"/>
+      <w:numFmt w:val="bullet"/>
+      <w:lvlText w:val=""/>
+      <w:lvlJc w:val="left"/>
+      <w:pPr>
+        <w:ind w:left="2880" w:hanging="360"/>
+      </w:pPr>
+      <w:rPr>
+        <w:rFonts w:ascii="Symbol" w:hAnsi="Symbol" w:hint="default"/>
+      </w:rPr>
+    </w:lvl>
+    <w:lvl w:ilvl="4" w:tplc="08090003" w:tentative="1">
+      <w:start w:val="1"/>
+      <w:numFmt w:val="bullet"/>
+      <w:lvlText w:val="o"/>
+      <w:lvlJc w:val="left"/>
+      <w:pPr>
+        <w:ind w:left="3600" w:hanging="360"/>
+      </w:pPr>
+      <w:rPr>
+        <w:rFonts w:ascii="Courier New" w:hAnsi="Courier New" w:hint="default"/>
+      </w:rPr>
+    </w:lvl>
+    <w:lvl w:ilvl="5" w:tplc="08090005" w:tentative="1">
+      <w:start w:val="1"/>
+      <w:numFmt w:val="bullet"/>
+      <w:lvlText w:val=""/>
+      <w:lvlJc w:val="left"/>
+      <w:pPr>
+        <w:ind w:left="4320" w:hanging="360"/>
+      </w:pPr>
+      <w:rPr>
+        <w:rFonts w:ascii="Wingdings" w:hAnsi="Wingdings" w:hint="default"/>
+      </w:rPr>
+    </w:lvl>
+    <w:lvl w:ilvl="6" w:tplc="08090001" w:tentative="1">
+      <w:start w:val="1"/>
+      <w:numFmt w:val="bullet"/>
+      <w:lvlText w:val=""/>
+      <w:lvlJc w:val="left"/>
+      <w:pPr>
+        <w:ind w:left="5040" w:hanging="360"/>
+      </w:pPr>
+      <w:rPr>
+        <w:rFonts w:ascii="Symbol" w:hAnsi="Symbol" w:hint="default"/>
+      </w:rPr>
+    </w:lvl>
+    <w:lvl w:ilvl="7" w:tplc="08090003" w:tentative="1">
+      <w:start w:val="1"/>
+      <w:numFmt w:val="bullet"/>
+      <w:lvlText w:val="o"/>
+      <w:lvlJc w:val="left"/>
+      <w:pPr>
+        <w:ind w:left="5760" w:hanging="360"/>
+      </w:pPr>
+      <w:rPr>
+        <w:rFonts w:ascii="Courier New" w:hAnsi="Courier New" w:hint="default"/>
+      </w:rPr>
+    </w:lvl>
+    <w:lvl w:ilvl="8" w:tplc="08090005" w:tentative="1">
+      <w:start w:val="1"/>
+      <w:numFmt w:val="bullet"/>
+      <w:lvlText w:val=""/>
+      <w:lvlJc w:val="left"/>
+      <w:pPr>
+        <w:ind w:left="6480" w:hanging="360"/>
+      </w:pPr>
+      <w:rPr>
+        <w:rFonts w:ascii="Wingdings" w:hAnsi="Wingdings" w:hint="default"/>
+      </w:rPr>
+    </w:lvl>
+  </w:abstractNum>
+  <w:abstractNum w:abstractNumId="3" w15:restartNumberingAfterBreak="0">
     <w:nsid w:val="7C0B7D1A"/>
     <w:multiLevelType w:val="hybridMultilevel"/>
     <w:tmpl w:val="2CA4EE20"/>
@@ -6356,6 +6770,12 @@
     <w:abstractNumId w:val="0"/>
   </w:num>
   <w:num w:numId="2" w16cid:durableId="570581313">
+    <w:abstractNumId w:val="3"/>
+  </w:num>
+  <w:num w:numId="3" w16cid:durableId="1780025385">
+    <w:abstractNumId w:val="2"/>
+  </w:num>
+  <w:num w:numId="4" w16cid:durableId="1101874902">
     <w:abstractNumId w:val="1"/>
   </w:num>
 </w:numbering>

</xml_diff>